<commit_message>
Se agrega el texto de manejo de ramas al resumen
</commit_message>
<xml_diff>
--- a/Resumen git.docx
+++ b/Resumen git.docx
@@ -6769,7 +6769,7 @@
           <w:sz w:val="24"/>
           <w:szCs w:val="24"/>
           <w:shd w:val="clear" w:color="auto" w:fill="272822"/>
-          <w:lang w:eastAsia="es-CO"/>
+          <w:lang w:val="en-US" w:eastAsia="es-CO"/>
         </w:rPr>
       </w:pPr>
       <w:r>
@@ -6780,7 +6780,7 @@
           <w:color w:val="F92672"/>
           <w:sz w:val="24"/>
           <w:szCs w:val="24"/>
-          <w:lang w:eastAsia="es-CO"/>
+          <w:lang w:val="en-US" w:eastAsia="es-CO"/>
         </w:rPr>
         <w:t>********************************************</w:t>
       </w:r>
@@ -8743,7 +8743,7 @@
           <w:sz w:val="24"/>
           <w:szCs w:val="24"/>
           <w:shd w:val="clear" w:color="auto" w:fill="272822"/>
-          <w:lang w:val="en-US" w:eastAsia="es-CO"/>
+          <w:lang w:val="es-ES" w:eastAsia="es-CO"/>
         </w:rPr>
       </w:pPr>
       <w:r>
@@ -8754,7 +8754,7 @@
           <w:color w:val="F92672"/>
           <w:sz w:val="24"/>
           <w:szCs w:val="24"/>
-          <w:lang w:val="en-US" w:eastAsia="es-CO"/>
+          <w:lang w:val="es-ES" w:eastAsia="es-CO"/>
         </w:rPr>
         <w:t>**************************************</w:t>
       </w:r>
@@ -10402,7 +10402,7 @@
           <w:sz w:val="24"/>
           <w:szCs w:val="24"/>
           <w:shd w:val="clear" w:color="auto" w:fill="272822"/>
-          <w:lang w:eastAsia="es-CO"/>
+          <w:lang w:val="en-US" w:eastAsia="es-CO"/>
         </w:rPr>
       </w:pPr>
       <w:r>
@@ -10413,7 +10413,7 @@
           <w:color w:val="F92672"/>
           <w:sz w:val="24"/>
           <w:szCs w:val="24"/>
-          <w:lang w:eastAsia="es-CO"/>
+          <w:lang w:val="en-US" w:eastAsia="es-CO"/>
         </w:rPr>
         <w:t>***************************************************************************</w:t>
       </w:r>
@@ -10427,20 +10427,20 @@
           <w:sz w:val="24"/>
           <w:szCs w:val="24"/>
           <w:shd w:val="clear" w:color="auto" w:fill="272822"/>
-          <w:lang w:eastAsia="es-CO"/>
-        </w:rPr>
-      </w:pPr>
-    </w:p>
-    <w:p>
-      <w:pPr>
-        <w:spacing w:after="0" w:line="240" w:lineRule="auto"/>
-        <w:rPr>
-          <w:rFonts w:ascii="Courier New" w:eastAsia="Times New Roman" w:hAnsi="Courier New" w:cs="Courier New"/>
-          <w:color w:val="DDDDDD"/>
-          <w:sz w:val="24"/>
-          <w:szCs w:val="24"/>
-          <w:shd w:val="clear" w:color="auto" w:fill="272822"/>
-          <w:lang w:eastAsia="es-CO"/>
+          <w:lang w:val="en-US" w:eastAsia="es-CO"/>
+        </w:rPr>
+      </w:pPr>
+    </w:p>
+    <w:p>
+      <w:pPr>
+        <w:spacing w:after="0" w:line="240" w:lineRule="auto"/>
+        <w:rPr>
+          <w:rFonts w:ascii="Courier New" w:eastAsia="Times New Roman" w:hAnsi="Courier New" w:cs="Courier New"/>
+          <w:color w:val="DDDDDD"/>
+          <w:sz w:val="24"/>
+          <w:szCs w:val="24"/>
+          <w:shd w:val="clear" w:color="auto" w:fill="272822"/>
+          <w:lang w:val="en-US" w:eastAsia="es-CO"/>
         </w:rPr>
       </w:pPr>
       <w:r>
@@ -10451,7 +10451,7 @@
           <w:color w:val="F92672"/>
           <w:sz w:val="24"/>
           <w:szCs w:val="24"/>
-          <w:lang w:eastAsia="es-CO"/>
+          <w:lang w:val="en-US" w:eastAsia="es-CO"/>
         </w:rPr>
         <w:t>*******************************************************************</w:t>
       </w:r>
@@ -10465,7 +10465,7 @@
           <w:sz w:val="24"/>
           <w:szCs w:val="24"/>
           <w:shd w:val="clear" w:color="auto" w:fill="272822"/>
-          <w:lang w:eastAsia="es-CO"/>
+          <w:lang w:val="en-US" w:eastAsia="es-CO"/>
         </w:rPr>
       </w:pPr>
       <w:r>
@@ -10476,43 +10476,30 @@
           <w:color w:val="F92672"/>
           <w:sz w:val="24"/>
           <w:szCs w:val="24"/>
-          <w:lang w:eastAsia="es-CO"/>
+          <w:lang w:val="en-US" w:eastAsia="es-CO"/>
         </w:rPr>
         <w:t>************************</w:t>
       </w:r>
-      <w:proofErr w:type="spellStart"/>
-      <w:r>
-        <w:rPr>
-          <w:rFonts w:ascii="Courier New" w:eastAsia="Times New Roman" w:hAnsi="Courier New" w:cs="Courier New"/>
-          <w:color w:val="DDDDDD"/>
-          <w:sz w:val="24"/>
-          <w:szCs w:val="24"/>
-          <w:shd w:val="clear" w:color="auto" w:fill="272822"/>
-          <w:lang w:eastAsia="es-CO"/>
-        </w:rPr>
-        <w:t>Merge</w:t>
-      </w:r>
-      <w:proofErr w:type="spellEnd"/>
-      <w:r>
-        <w:rPr>
-          <w:rFonts w:ascii="Courier New" w:eastAsia="Times New Roman" w:hAnsi="Courier New" w:cs="Courier New"/>
-          <w:color w:val="DDDDDD"/>
-          <w:sz w:val="24"/>
-          <w:szCs w:val="24"/>
-          <w:shd w:val="clear" w:color="auto" w:fill="272822"/>
-          <w:lang w:eastAsia="es-CO"/>
-        </w:rPr>
-        <w:t xml:space="preserve"> entre </w:t>
-      </w:r>
-      <w:proofErr w:type="spellStart"/>
-      <w:r>
-        <w:rPr>
-          <w:rFonts w:ascii="Courier New" w:eastAsia="Times New Roman" w:hAnsi="Courier New" w:cs="Courier New"/>
-          <w:color w:val="DDDDDD"/>
-          <w:sz w:val="24"/>
-          <w:szCs w:val="24"/>
-          <w:shd w:val="clear" w:color="auto" w:fill="272822"/>
-          <w:lang w:eastAsia="es-CO"/>
+      <w:r>
+        <w:rPr>
+          <w:rFonts w:ascii="Courier New" w:eastAsia="Times New Roman" w:hAnsi="Courier New" w:cs="Courier New"/>
+          <w:color w:val="DDDDDD"/>
+          <w:sz w:val="24"/>
+          <w:szCs w:val="24"/>
+          <w:shd w:val="clear" w:color="auto" w:fill="272822"/>
+          <w:lang w:val="en-US" w:eastAsia="es-CO"/>
+        </w:rPr>
+        <w:t xml:space="preserve">Merge entre </w:t>
+      </w:r>
+      <w:proofErr w:type="spellStart"/>
+      <w:r>
+        <w:rPr>
+          <w:rFonts w:ascii="Courier New" w:eastAsia="Times New Roman" w:hAnsi="Courier New" w:cs="Courier New"/>
+          <w:color w:val="DDDDDD"/>
+          <w:sz w:val="24"/>
+          <w:szCs w:val="24"/>
+          <w:shd w:val="clear" w:color="auto" w:fill="272822"/>
+          <w:lang w:val="en-US" w:eastAsia="es-CO"/>
         </w:rPr>
         <w:t>branchs</w:t>
       </w:r>
@@ -10525,7 +10512,7 @@
           <w:color w:val="F92672"/>
           <w:sz w:val="24"/>
           <w:szCs w:val="24"/>
-          <w:lang w:eastAsia="es-CO"/>
+          <w:lang w:val="en-US" w:eastAsia="es-CO"/>
         </w:rPr>
         <w:t>************************</w:t>
       </w:r>
@@ -10539,7 +10526,7 @@
           <w:sz w:val="24"/>
           <w:szCs w:val="24"/>
           <w:shd w:val="clear" w:color="auto" w:fill="272822"/>
-          <w:lang w:eastAsia="es-CO"/>
+          <w:lang w:val="en-US" w:eastAsia="es-CO"/>
         </w:rPr>
       </w:pPr>
       <w:r>
@@ -10550,7 +10537,7 @@
           <w:color w:val="F92672"/>
           <w:sz w:val="24"/>
           <w:szCs w:val="24"/>
-          <w:lang w:eastAsia="es-CO"/>
+          <w:lang w:val="en-US" w:eastAsia="es-CO"/>
         </w:rPr>
         <w:t>*******************************************************************</w:t>
       </w:r>
@@ -10564,79 +10551,42 @@
           <w:sz w:val="24"/>
           <w:szCs w:val="24"/>
           <w:shd w:val="clear" w:color="auto" w:fill="272822"/>
-          <w:lang w:eastAsia="es-CO"/>
-        </w:rPr>
-      </w:pPr>
-    </w:p>
-    <w:p>
-      <w:pPr>
-        <w:spacing w:after="0" w:line="240" w:lineRule="auto"/>
-        <w:rPr>
-          <w:rFonts w:ascii="Courier New" w:eastAsia="Times New Roman" w:hAnsi="Courier New" w:cs="Courier New"/>
-          <w:color w:val="DDDDDD"/>
-          <w:sz w:val="24"/>
-          <w:szCs w:val="24"/>
-          <w:shd w:val="clear" w:color="auto" w:fill="272822"/>
-          <w:lang w:eastAsia="es-CO"/>
-        </w:rPr>
-      </w:pPr>
-      <w:proofErr w:type="spellStart"/>
-      <w:r>
-        <w:rPr>
-          <w:rFonts w:ascii="Courier New" w:eastAsia="Times New Roman" w:hAnsi="Courier New" w:cs="Courier New"/>
-          <w:color w:val="DDDDDD"/>
-          <w:sz w:val="24"/>
-          <w:szCs w:val="24"/>
-          <w:shd w:val="clear" w:color="auto" w:fill="272822"/>
-          <w:lang w:eastAsia="es-CO"/>
-        </w:rPr>
-        <w:t>git</w:t>
-      </w:r>
-      <w:proofErr w:type="spellEnd"/>
-      <w:r>
-        <w:rPr>
-          <w:rFonts w:ascii="Courier New" w:eastAsia="Times New Roman" w:hAnsi="Courier New" w:cs="Courier New"/>
-          <w:color w:val="DDDDDD"/>
-          <w:sz w:val="24"/>
-          <w:szCs w:val="24"/>
-          <w:shd w:val="clear" w:color="auto" w:fill="272822"/>
-          <w:lang w:eastAsia="es-CO"/>
-        </w:rPr>
-        <w:t xml:space="preserve"> </w:t>
-      </w:r>
-      <w:proofErr w:type="spellStart"/>
-      <w:r>
-        <w:rPr>
-          <w:rFonts w:ascii="Courier New" w:eastAsia="Times New Roman" w:hAnsi="Courier New" w:cs="Courier New"/>
-          <w:color w:val="DDDDDD"/>
-          <w:sz w:val="24"/>
-          <w:szCs w:val="24"/>
-          <w:shd w:val="clear" w:color="auto" w:fill="272822"/>
-          <w:lang w:eastAsia="es-CO"/>
-        </w:rPr>
-        <w:t>merge</w:t>
-      </w:r>
-      <w:proofErr w:type="spellEnd"/>
-      <w:r>
-        <w:rPr>
-          <w:rFonts w:ascii="Courier New" w:eastAsia="Times New Roman" w:hAnsi="Courier New" w:cs="Courier New"/>
-          <w:color w:val="DDDDDD"/>
-          <w:sz w:val="24"/>
-          <w:szCs w:val="24"/>
-          <w:shd w:val="clear" w:color="auto" w:fill="272822"/>
-          <w:lang w:eastAsia="es-CO"/>
-        </w:rPr>
-        <w:t xml:space="preserve"> (</w:t>
-      </w:r>
-      <w:proofErr w:type="spellStart"/>
-      <w:r>
-        <w:rPr>
-          <w:rFonts w:ascii="Courier New" w:eastAsia="Times New Roman" w:hAnsi="Courier New" w:cs="Courier New"/>
-          <w:color w:val="DDDDDD"/>
-          <w:sz w:val="24"/>
-          <w:szCs w:val="24"/>
-          <w:shd w:val="clear" w:color="auto" w:fill="272822"/>
-          <w:lang w:eastAsia="es-CO"/>
+          <w:lang w:val="en-US" w:eastAsia="es-CO"/>
+        </w:rPr>
+      </w:pPr>
+    </w:p>
+    <w:p>
+      <w:pPr>
+        <w:spacing w:after="0" w:line="240" w:lineRule="auto"/>
+        <w:rPr>
+          <w:rFonts w:ascii="Courier New" w:eastAsia="Times New Roman" w:hAnsi="Courier New" w:cs="Courier New"/>
+          <w:color w:val="DDDDDD"/>
+          <w:sz w:val="24"/>
+          <w:szCs w:val="24"/>
+          <w:shd w:val="clear" w:color="auto" w:fill="272822"/>
+          <w:lang w:val="en-US" w:eastAsia="es-CO"/>
+        </w:rPr>
+      </w:pPr>
+      <w:r>
+        <w:rPr>
+          <w:rFonts w:ascii="Courier New" w:eastAsia="Times New Roman" w:hAnsi="Courier New" w:cs="Courier New"/>
+          <w:color w:val="DDDDDD"/>
+          <w:sz w:val="24"/>
+          <w:szCs w:val="24"/>
+          <w:shd w:val="clear" w:color="auto" w:fill="272822"/>
+          <w:lang w:val="en-US" w:eastAsia="es-CO"/>
+        </w:rPr>
+        <w:t>git merge (</w:t>
+      </w:r>
+      <w:proofErr w:type="spellStart"/>
+      <w:r>
+        <w:rPr>
+          <w:rFonts w:ascii="Courier New" w:eastAsia="Times New Roman" w:hAnsi="Courier New" w:cs="Courier New"/>
+          <w:color w:val="DDDDDD"/>
+          <w:sz w:val="24"/>
+          <w:szCs w:val="24"/>
+          <w:shd w:val="clear" w:color="auto" w:fill="272822"/>
+          <w:lang w:val="en-US" w:eastAsia="es-CO"/>
         </w:rPr>
         <w:t>branchName</w:t>
       </w:r>
@@ -10648,7 +10598,7 @@
           <w:sz w:val="24"/>
           <w:szCs w:val="24"/>
           <w:shd w:val="clear" w:color="auto" w:fill="272822"/>
-          <w:lang w:eastAsia="es-CO"/>
+          <w:lang w:val="en-US" w:eastAsia="es-CO"/>
         </w:rPr>
         <w:t>)</w:t>
       </w:r>
@@ -10662,7 +10612,7 @@
           <w:sz w:val="24"/>
           <w:szCs w:val="24"/>
           <w:shd w:val="clear" w:color="auto" w:fill="272822"/>
-          <w:lang w:eastAsia="es-CO"/>
+          <w:lang w:val="en-US" w:eastAsia="es-CO"/>
         </w:rPr>
       </w:pPr>
     </w:p>
@@ -13804,19 +13754,41 @@
           <w:color w:val="273B47"/>
           <w:sz w:val="24"/>
           <w:szCs w:val="24"/>
-          <w:lang w:val="en-US" w:eastAsia="es-CO"/>
-        </w:rPr>
-      </w:pPr>
-      <w:proofErr w:type="spellStart"/>
-      <w:r>
-        <w:rPr>
-          <w:rFonts w:ascii="Courier New" w:eastAsia="Times New Roman" w:hAnsi="Courier New" w:cs="Courier New"/>
-          <w:color w:val="273B47"/>
-          <w:sz w:val="20"/>
-          <w:szCs w:val="20"/>
-          <w:lang w:val="en-US" w:eastAsia="es-CO"/>
+          <w:lang w:val="es-ES" w:eastAsia="es-CO"/>
+        </w:rPr>
+      </w:pPr>
+      <w:proofErr w:type="spellStart"/>
+      <w:r>
+        <w:rPr>
+          <w:rFonts w:ascii="Courier New" w:eastAsia="Times New Roman" w:hAnsi="Courier New" w:cs="Courier New"/>
+          <w:color w:val="273B47"/>
+          <w:sz w:val="20"/>
+          <w:szCs w:val="20"/>
+          <w:lang w:val="es-ES" w:eastAsia="es-CO"/>
         </w:rPr>
         <w:lastRenderedPageBreak/>
+        <w:t>ssh-add</w:t>
+      </w:r>
+      <w:proofErr w:type="spellEnd"/>
+      <w:r>
+        <w:rPr>
+          <w:rFonts w:ascii="Courier New" w:eastAsia="Times New Roman" w:hAnsi="Courier New" w:cs="Courier New"/>
+          <w:color w:val="273B47"/>
+          <w:sz w:val="20"/>
+          <w:szCs w:val="20"/>
+          <w:lang w:val="es-ES" w:eastAsia="es-CO"/>
+        </w:rPr>
+        <w:t xml:space="preserve"> -K ~/.</w:t>
+      </w:r>
+      <w:proofErr w:type="spellStart"/>
+      <w:r>
+        <w:rPr>
+          <w:rFonts w:ascii="Courier New" w:eastAsia="Times New Roman" w:hAnsi="Courier New" w:cs="Courier New"/>
+          <w:color w:val="273B47"/>
+          <w:sz w:val="20"/>
+          <w:szCs w:val="20"/>
+          <w:lang w:val="es-ES" w:eastAsia="es-CO"/>
+        </w:rPr>
         <w:t>ssh</w:t>
       </w:r>
       <w:proofErr w:type="spellEnd"/>
@@ -13826,29 +13798,7 @@
           <w:color w:val="273B47"/>
           <w:sz w:val="20"/>
           <w:szCs w:val="20"/>
-          <w:lang w:val="en-US" w:eastAsia="es-CO"/>
-        </w:rPr>
-        <w:t>-add -K ~/.</w:t>
-      </w:r>
-      <w:proofErr w:type="spellStart"/>
-      <w:r>
-        <w:rPr>
-          <w:rFonts w:ascii="Courier New" w:eastAsia="Times New Roman" w:hAnsi="Courier New" w:cs="Courier New"/>
-          <w:color w:val="273B47"/>
-          <w:sz w:val="20"/>
-          <w:szCs w:val="20"/>
-          <w:lang w:val="en-US" w:eastAsia="es-CO"/>
-        </w:rPr>
-        <w:t>ssh</w:t>
-      </w:r>
-      <w:proofErr w:type="spellEnd"/>
-      <w:r>
-        <w:rPr>
-          <w:rFonts w:ascii="Courier New" w:eastAsia="Times New Roman" w:hAnsi="Courier New" w:cs="Courier New"/>
-          <w:color w:val="273B47"/>
-          <w:sz w:val="20"/>
-          <w:szCs w:val="20"/>
-          <w:lang w:val="en-US" w:eastAsia="es-CO"/>
+          <w:lang w:val="es-ES" w:eastAsia="es-CO"/>
         </w:rPr>
         <w:t>/</w:t>
       </w:r>
@@ -13859,7 +13809,7 @@
           <w:color w:val="273B47"/>
           <w:sz w:val="20"/>
           <w:szCs w:val="20"/>
-          <w:lang w:val="en-US" w:eastAsia="es-CO"/>
+          <w:lang w:val="es-ES" w:eastAsia="es-CO"/>
         </w:rPr>
         <w:t>id_rsa</w:t>
       </w:r>
@@ -13868,14 +13818,14 @@
     <w:p>
       <w:pPr>
         <w:rPr>
-          <w:lang w:val="en-US"/>
-        </w:rPr>
-      </w:pPr>
-    </w:p>
-    <w:p>
-      <w:pPr>
-        <w:rPr>
-          <w:lang w:val="en-US"/>
+          <w:lang w:val="es-ES"/>
+        </w:rPr>
+      </w:pPr>
+    </w:p>
+    <w:p>
+      <w:pPr>
+        <w:rPr>
+          <w:lang w:val="es-ES"/>
         </w:rPr>
       </w:pPr>
     </w:p>
@@ -17314,6 +17264,665 @@
           <w:lang w:val="es-ES"/>
         </w:rPr>
       </w:pPr>
+    </w:p>
+    <w:p>
+      <w:pPr>
+        <w:rPr>
+          <w:lang w:val="es-ES"/>
+        </w:rPr>
+      </w:pPr>
+    </w:p>
+    <w:p>
+      <w:pPr>
+        <w:pBdr>
+          <w:bottom w:val="single" w:sz="6" w:space="11" w:color="E9E9E9"/>
+        </w:pBdr>
+        <w:spacing w:after="225" w:line="240" w:lineRule="auto"/>
+        <w:outlineLvl w:val="0"/>
+        <w:rPr>
+          <w:rFonts w:ascii="cooper_hewittmedium" w:eastAsia="Times New Roman" w:hAnsi="cooper_hewittmedium" w:cs="Times New Roman"/>
+          <w:b/>
+          <w:bCs/>
+          <w:color w:val="000000"/>
+          <w:spacing w:val="-2"/>
+          <w:kern w:val="36"/>
+          <w:sz w:val="36"/>
+          <w:szCs w:val="36"/>
+          <w:lang w:val="es-ES" w:eastAsia="es-ES"/>
+        </w:rPr>
+      </w:pPr>
+      <w:r>
+        <w:rPr>
+          <w:rFonts w:ascii="cooper_hewittmedium" w:eastAsia="Times New Roman" w:hAnsi="cooper_hewittmedium" w:cs="Times New Roman"/>
+          <w:b/>
+          <w:bCs/>
+          <w:color w:val="000000"/>
+          <w:spacing w:val="-2"/>
+          <w:kern w:val="36"/>
+          <w:sz w:val="36"/>
+          <w:szCs w:val="36"/>
+          <w:lang w:val="es-ES" w:eastAsia="es-ES"/>
+        </w:rPr>
+        <w:t>Manejo de ramas en GitHub</w:t>
+      </w:r>
+    </w:p>
+    <w:p>
+      <w:pPr>
+        <w:spacing w:before="113" w:after="113" w:line="240" w:lineRule="auto"/>
+        <w:rPr>
+          <w:rFonts w:ascii="Lato" w:eastAsia="Times New Roman" w:hAnsi="Lato" w:cs="Times New Roman"/>
+          <w:color w:val="273B47"/>
+          <w:sz w:val="24"/>
+          <w:szCs w:val="24"/>
+          <w:lang w:val="es-ES" w:eastAsia="es-ES"/>
+        </w:rPr>
+      </w:pPr>
+      <w:r>
+        <w:rPr>
+          <w:rFonts w:ascii="Lato" w:eastAsia="Times New Roman" w:hAnsi="Lato" w:cs="Times New Roman"/>
+          <w:color w:val="273B47"/>
+          <w:sz w:val="24"/>
+          <w:szCs w:val="24"/>
+          <w:lang w:val="es-ES" w:eastAsia="es-ES"/>
+        </w:rPr>
+        <w:t xml:space="preserve">Puedes trabajar con ramas que nunca envías a GitHub, así como </w:t>
+      </w:r>
+      <w:proofErr w:type="gramStart"/>
+      <w:r>
+        <w:rPr>
+          <w:rFonts w:ascii="Lato" w:eastAsia="Times New Roman" w:hAnsi="Lato" w:cs="Times New Roman"/>
+          <w:color w:val="273B47"/>
+          <w:sz w:val="24"/>
+          <w:szCs w:val="24"/>
+          <w:lang w:val="es-ES" w:eastAsia="es-ES"/>
+        </w:rPr>
+        <w:t>pueden</w:t>
+      </w:r>
+      <w:proofErr w:type="gramEnd"/>
+      <w:r>
+        <w:rPr>
+          <w:rFonts w:ascii="Lato" w:eastAsia="Times New Roman" w:hAnsi="Lato" w:cs="Times New Roman"/>
+          <w:color w:val="273B47"/>
+          <w:sz w:val="24"/>
+          <w:szCs w:val="24"/>
+          <w:lang w:val="es-ES" w:eastAsia="es-ES"/>
+        </w:rPr>
+        <w:t xml:space="preserve"> haber ramas importantes en GitHub que nunca usas en el repositorio local. Lo importante es que aprendas a manejarlas para trabajar profesionalmente.</w:t>
+      </w:r>
+    </w:p>
+    <w:p>
+      <w:pPr>
+        <w:numPr>
+          <w:ilvl w:val="0"/>
+          <w:numId w:val="6"/>
+        </w:numPr>
+        <w:spacing w:after="0" w:line="240" w:lineRule="auto"/>
+        <w:ind w:left="113" w:right="113"/>
+        <w:rPr>
+          <w:rFonts w:ascii="Lato" w:eastAsia="Times New Roman" w:hAnsi="Lato" w:cs="Times New Roman"/>
+          <w:color w:val="273B47"/>
+          <w:sz w:val="24"/>
+          <w:szCs w:val="24"/>
+          <w:lang w:val="es-ES" w:eastAsia="es-ES"/>
+        </w:rPr>
+      </w:pPr>
+      <w:r>
+        <w:rPr>
+          <w:rFonts w:ascii="Lato" w:eastAsia="Times New Roman" w:hAnsi="Lato" w:cs="Times New Roman"/>
+          <w:color w:val="273B47"/>
+          <w:sz w:val="24"/>
+          <w:szCs w:val="24"/>
+          <w:lang w:val="es-ES" w:eastAsia="es-ES"/>
+        </w:rPr>
+        <w:t>Crear una rama en el repositorio local: </w:t>
+      </w:r>
+      <w:proofErr w:type="spellStart"/>
+      <w:r>
+        <w:rPr>
+          <w:rFonts w:ascii="Courier New" w:eastAsia="Times New Roman" w:hAnsi="Courier New" w:cs="Courier New"/>
+          <w:b/>
+          <w:bCs/>
+          <w:color w:val="273B47"/>
+          <w:sz w:val="20"/>
+          <w:szCs w:val="20"/>
+          <w:lang w:val="es-ES" w:eastAsia="es-ES"/>
+        </w:rPr>
+        <w:t>git</w:t>
+      </w:r>
+      <w:proofErr w:type="spellEnd"/>
+      <w:r>
+        <w:rPr>
+          <w:rFonts w:ascii="Courier New" w:eastAsia="Times New Roman" w:hAnsi="Courier New" w:cs="Courier New"/>
+          <w:b/>
+          <w:bCs/>
+          <w:color w:val="273B47"/>
+          <w:sz w:val="20"/>
+          <w:szCs w:val="20"/>
+          <w:lang w:val="es-ES" w:eastAsia="es-ES"/>
+        </w:rPr>
+        <w:t xml:space="preserve"> </w:t>
+      </w:r>
+      <w:proofErr w:type="spellStart"/>
+      <w:r>
+        <w:rPr>
+          <w:rFonts w:ascii="Courier New" w:eastAsia="Times New Roman" w:hAnsi="Courier New" w:cs="Courier New"/>
+          <w:b/>
+          <w:bCs/>
+          <w:color w:val="273B47"/>
+          <w:sz w:val="20"/>
+          <w:szCs w:val="20"/>
+          <w:lang w:val="es-ES" w:eastAsia="es-ES"/>
+        </w:rPr>
+        <w:t>branch</w:t>
+      </w:r>
+      <w:proofErr w:type="spellEnd"/>
+      <w:r>
+        <w:rPr>
+          <w:rFonts w:ascii="Courier New" w:eastAsia="Times New Roman" w:hAnsi="Courier New" w:cs="Courier New"/>
+          <w:b/>
+          <w:bCs/>
+          <w:color w:val="273B47"/>
+          <w:sz w:val="20"/>
+          <w:szCs w:val="20"/>
+          <w:lang w:val="es-ES" w:eastAsia="es-ES"/>
+        </w:rPr>
+        <w:t xml:space="preserve"> nombre-de-la-rama</w:t>
+      </w:r>
+      <w:r>
+        <w:rPr>
+          <w:rFonts w:ascii="Lato" w:eastAsia="Times New Roman" w:hAnsi="Lato" w:cs="Times New Roman"/>
+          <w:color w:val="273B47"/>
+          <w:sz w:val="24"/>
+          <w:szCs w:val="24"/>
+          <w:lang w:val="es-ES" w:eastAsia="es-ES"/>
+        </w:rPr>
+        <w:t> o </w:t>
+      </w:r>
+      <w:proofErr w:type="spellStart"/>
+      <w:r>
+        <w:rPr>
+          <w:rFonts w:ascii="Courier New" w:eastAsia="Times New Roman" w:hAnsi="Courier New" w:cs="Courier New"/>
+          <w:b/>
+          <w:bCs/>
+          <w:color w:val="273B47"/>
+          <w:sz w:val="20"/>
+          <w:szCs w:val="20"/>
+          <w:lang w:val="es-ES" w:eastAsia="es-ES"/>
+        </w:rPr>
+        <w:t>git</w:t>
+      </w:r>
+      <w:proofErr w:type="spellEnd"/>
+      <w:r>
+        <w:rPr>
+          <w:rFonts w:ascii="Courier New" w:eastAsia="Times New Roman" w:hAnsi="Courier New" w:cs="Courier New"/>
+          <w:b/>
+          <w:bCs/>
+          <w:color w:val="273B47"/>
+          <w:sz w:val="20"/>
+          <w:szCs w:val="20"/>
+          <w:lang w:val="es-ES" w:eastAsia="es-ES"/>
+        </w:rPr>
+        <w:t xml:space="preserve"> </w:t>
+      </w:r>
+      <w:proofErr w:type="spellStart"/>
+      <w:r>
+        <w:rPr>
+          <w:rFonts w:ascii="Courier New" w:eastAsia="Times New Roman" w:hAnsi="Courier New" w:cs="Courier New"/>
+          <w:b/>
+          <w:bCs/>
+          <w:color w:val="273B47"/>
+          <w:sz w:val="20"/>
+          <w:szCs w:val="20"/>
+          <w:lang w:val="es-ES" w:eastAsia="es-ES"/>
+        </w:rPr>
+        <w:t>checkout</w:t>
+      </w:r>
+      <w:proofErr w:type="spellEnd"/>
+      <w:r>
+        <w:rPr>
+          <w:rFonts w:ascii="Courier New" w:eastAsia="Times New Roman" w:hAnsi="Courier New" w:cs="Courier New"/>
+          <w:b/>
+          <w:bCs/>
+          <w:color w:val="273B47"/>
+          <w:sz w:val="20"/>
+          <w:szCs w:val="20"/>
+          <w:lang w:val="es-ES" w:eastAsia="es-ES"/>
+        </w:rPr>
+        <w:t xml:space="preserve"> -b nombre-de-la-rama</w:t>
+      </w:r>
+      <w:r>
+        <w:rPr>
+          <w:rFonts w:ascii="Lato" w:eastAsia="Times New Roman" w:hAnsi="Lato" w:cs="Times New Roman"/>
+          <w:color w:val="273B47"/>
+          <w:sz w:val="24"/>
+          <w:szCs w:val="24"/>
+          <w:lang w:val="es-ES" w:eastAsia="es-ES"/>
+        </w:rPr>
+        <w:t>.</w:t>
+      </w:r>
+    </w:p>
+    <w:p>
+      <w:pPr>
+        <w:numPr>
+          <w:ilvl w:val="0"/>
+          <w:numId w:val="6"/>
+        </w:numPr>
+        <w:spacing w:after="0" w:line="240" w:lineRule="auto"/>
+        <w:ind w:left="113" w:right="113"/>
+        <w:rPr>
+          <w:rFonts w:ascii="Lato" w:eastAsia="Times New Roman" w:hAnsi="Lato" w:cs="Times New Roman"/>
+          <w:color w:val="273B47"/>
+          <w:sz w:val="24"/>
+          <w:szCs w:val="24"/>
+          <w:lang w:val="es-ES" w:eastAsia="es-ES"/>
+        </w:rPr>
+      </w:pPr>
+      <w:r>
+        <w:rPr>
+          <w:rFonts w:ascii="Lato" w:eastAsia="Times New Roman" w:hAnsi="Lato" w:cs="Times New Roman"/>
+          <w:color w:val="273B47"/>
+          <w:sz w:val="24"/>
+          <w:szCs w:val="24"/>
+          <w:lang w:val="es-ES" w:eastAsia="es-ES"/>
+        </w:rPr>
+        <w:t>Publicar una rama local al repositorio remoto: </w:t>
+      </w:r>
+      <w:proofErr w:type="spellStart"/>
+      <w:r>
+        <w:rPr>
+          <w:rFonts w:ascii="Courier New" w:eastAsia="Times New Roman" w:hAnsi="Courier New" w:cs="Courier New"/>
+          <w:b/>
+          <w:bCs/>
+          <w:color w:val="273B47"/>
+          <w:sz w:val="20"/>
+          <w:szCs w:val="20"/>
+          <w:lang w:val="es-ES" w:eastAsia="es-ES"/>
+        </w:rPr>
+        <w:t>git</w:t>
+      </w:r>
+      <w:proofErr w:type="spellEnd"/>
+      <w:r>
+        <w:rPr>
+          <w:rFonts w:ascii="Courier New" w:eastAsia="Times New Roman" w:hAnsi="Courier New" w:cs="Courier New"/>
+          <w:b/>
+          <w:bCs/>
+          <w:color w:val="273B47"/>
+          <w:sz w:val="20"/>
+          <w:szCs w:val="20"/>
+          <w:lang w:val="es-ES" w:eastAsia="es-ES"/>
+        </w:rPr>
+        <w:t xml:space="preserve"> </w:t>
+      </w:r>
+      <w:proofErr w:type="spellStart"/>
+      <w:r>
+        <w:rPr>
+          <w:rFonts w:ascii="Courier New" w:eastAsia="Times New Roman" w:hAnsi="Courier New" w:cs="Courier New"/>
+          <w:b/>
+          <w:bCs/>
+          <w:color w:val="273B47"/>
+          <w:sz w:val="20"/>
+          <w:szCs w:val="20"/>
+          <w:lang w:val="es-ES" w:eastAsia="es-ES"/>
+        </w:rPr>
+        <w:t>push</w:t>
+      </w:r>
+      <w:proofErr w:type="spellEnd"/>
+      <w:r>
+        <w:rPr>
+          <w:rFonts w:ascii="Courier New" w:eastAsia="Times New Roman" w:hAnsi="Courier New" w:cs="Courier New"/>
+          <w:b/>
+          <w:bCs/>
+          <w:color w:val="273B47"/>
+          <w:sz w:val="20"/>
+          <w:szCs w:val="20"/>
+          <w:lang w:val="es-ES" w:eastAsia="es-ES"/>
+        </w:rPr>
+        <w:t xml:space="preserve"> </w:t>
+      </w:r>
+      <w:proofErr w:type="spellStart"/>
+      <w:r>
+        <w:rPr>
+          <w:rFonts w:ascii="Courier New" w:eastAsia="Times New Roman" w:hAnsi="Courier New" w:cs="Courier New"/>
+          <w:b/>
+          <w:bCs/>
+          <w:color w:val="273B47"/>
+          <w:sz w:val="20"/>
+          <w:szCs w:val="20"/>
+          <w:lang w:val="es-ES" w:eastAsia="es-ES"/>
+        </w:rPr>
+        <w:t>origin</w:t>
+      </w:r>
+      <w:proofErr w:type="spellEnd"/>
+      <w:r>
+        <w:rPr>
+          <w:rFonts w:ascii="Courier New" w:eastAsia="Times New Roman" w:hAnsi="Courier New" w:cs="Courier New"/>
+          <w:b/>
+          <w:bCs/>
+          <w:color w:val="273B47"/>
+          <w:sz w:val="20"/>
+          <w:szCs w:val="20"/>
+          <w:lang w:val="es-ES" w:eastAsia="es-ES"/>
+        </w:rPr>
+        <w:t xml:space="preserve"> nombre-de-la-rama</w:t>
+      </w:r>
+      <w:r>
+        <w:rPr>
+          <w:rFonts w:ascii="Lato" w:eastAsia="Times New Roman" w:hAnsi="Lato" w:cs="Times New Roman"/>
+          <w:color w:val="273B47"/>
+          <w:sz w:val="24"/>
+          <w:szCs w:val="24"/>
+          <w:lang w:val="es-ES" w:eastAsia="es-ES"/>
+        </w:rPr>
+        <w:t>.</w:t>
+      </w:r>
+    </w:p>
+    <w:p>
+      <w:pPr>
+        <w:spacing w:after="0" w:line="240" w:lineRule="auto"/>
+        <w:rPr>
+          <w:rFonts w:ascii="Lato" w:eastAsia="Times New Roman" w:hAnsi="Lato" w:cs="Times New Roman"/>
+          <w:color w:val="273B47"/>
+          <w:sz w:val="24"/>
+          <w:szCs w:val="24"/>
+          <w:lang w:val="es-ES" w:eastAsia="es-ES"/>
+        </w:rPr>
+      </w:pPr>
+      <w:r>
+        <w:rPr>
+          <w:rFonts w:ascii="Lato" w:eastAsia="Times New Roman" w:hAnsi="Lato" w:cs="Times New Roman"/>
+          <w:color w:val="273B47"/>
+          <w:sz w:val="24"/>
+          <w:szCs w:val="24"/>
+          <w:lang w:val="es-ES" w:eastAsia="es-ES"/>
+        </w:rPr>
+        <w:t>Recuerda que podemos ver gráficamente nuestro entorno y flujo de trabajo local con Git usando el comando </w:t>
+      </w:r>
+      <w:proofErr w:type="spellStart"/>
+      <w:r>
+        <w:rPr>
+          <w:rFonts w:ascii="Courier New" w:eastAsia="Times New Roman" w:hAnsi="Courier New" w:cs="Courier New"/>
+          <w:color w:val="273B47"/>
+          <w:sz w:val="20"/>
+          <w:szCs w:val="20"/>
+          <w:lang w:val="es-ES" w:eastAsia="es-ES"/>
+        </w:rPr>
+        <w:t>gitk</w:t>
+      </w:r>
+      <w:proofErr w:type="spellEnd"/>
+      <w:r>
+        <w:rPr>
+          <w:rFonts w:ascii="Lato" w:eastAsia="Times New Roman" w:hAnsi="Lato" w:cs="Times New Roman"/>
+          <w:color w:val="273B47"/>
+          <w:sz w:val="24"/>
+          <w:szCs w:val="24"/>
+          <w:lang w:val="es-ES" w:eastAsia="es-ES"/>
+        </w:rPr>
+        <w:t>.</w:t>
+      </w:r>
+    </w:p>
+    <w:p>
+      <w:pPr>
+        <w:rPr>
+          <w:lang w:val="es-ES"/>
+        </w:rPr>
+      </w:pPr>
+    </w:p>
+    <w:p>
+      <w:pPr>
+        <w:rPr>
+          <w:lang w:val="es-ES"/>
+        </w:rPr>
+      </w:pPr>
+      <w:r>
+        <w:rPr>
+          <w:noProof/>
+        </w:rPr>
+        <w:lastRenderedPageBreak/>
+        <w:drawing>
+          <wp:inline distT="0" distB="0" distL="0" distR="0">
+            <wp:extent cx="5612130" cy="7938135"/>
+            <wp:effectExtent l="0" t="0" r="7620" b="5715"/>
+            <wp:docPr id="6" name="Imagen 6"/>
+            <wp:cNvGraphicFramePr>
+              <a:graphicFrameLocks xmlns:a="http://schemas.openxmlformats.org/drawingml/2006/main" noChangeAspect="1"/>
+            </wp:cNvGraphicFramePr>
+            <a:graphic xmlns:a="http://schemas.openxmlformats.org/drawingml/2006/main">
+              <a:graphicData uri="http://schemas.openxmlformats.org/drawingml/2006/picture">
+                <pic:pic xmlns:pic="http://schemas.openxmlformats.org/drawingml/2006/picture">
+                  <pic:nvPicPr>
+                    <pic:cNvPr id="0" name="Picture 1"/>
+                    <pic:cNvPicPr>
+                      <a:picLocks noChangeAspect="1" noChangeArrowheads="1"/>
+                    </pic:cNvPicPr>
+                  </pic:nvPicPr>
+                  <pic:blipFill>
+                    <a:blip r:embed="rId11" cstate="print">
+                      <a:extLst>
+                        <a:ext uri="{28A0092B-C50C-407E-A947-70E740481C1C}">
+                          <a14:useLocalDpi xmlns:a14="http://schemas.microsoft.com/office/drawing/2010/main" val="0"/>
+                        </a:ext>
+                      </a:extLst>
+                    </a:blip>
+                    <a:srcRect/>
+                    <a:stretch>
+                      <a:fillRect/>
+                    </a:stretch>
+                  </pic:blipFill>
+                  <pic:spPr bwMode="auto">
+                    <a:xfrm>
+                      <a:off x="0" y="0"/>
+                      <a:ext cx="5612130" cy="7938135"/>
+                    </a:xfrm>
+                    <a:prstGeom prst="rect">
+                      <a:avLst/>
+                    </a:prstGeom>
+                    <a:noFill/>
+                    <a:ln>
+                      <a:noFill/>
+                    </a:ln>
+                  </pic:spPr>
+                </pic:pic>
+              </a:graphicData>
+            </a:graphic>
+          </wp:inline>
+        </w:drawing>
+      </w:r>
+    </w:p>
+    <w:p>
+      <w:pPr>
+        <w:rPr>
+          <w:lang w:val="es-ES"/>
+        </w:rPr>
+      </w:pPr>
+    </w:p>
+    <w:p>
+      <w:pPr>
+        <w:rPr>
+          <w:lang w:val="es-ES"/>
+        </w:rPr>
+      </w:pPr>
+      <w:r>
+        <w:rPr>
+          <w:lang w:val="es-ES"/>
+        </w:rPr>
+        <w:lastRenderedPageBreak/>
+        <w:t xml:space="preserve">Aquí están los comandos de </w:t>
+      </w:r>
+      <w:proofErr w:type="spellStart"/>
+      <w:r>
+        <w:rPr>
+          <w:lang w:val="es-ES"/>
+        </w:rPr>
+        <w:t>git</w:t>
+      </w:r>
+      <w:proofErr w:type="spellEnd"/>
+      <w:r>
+        <w:rPr>
+          <w:lang w:val="es-ES"/>
+        </w:rPr>
+        <w:t xml:space="preserve"> </w:t>
+      </w:r>
+    </w:p>
+    <w:p>
+      <w:hyperlink r:id="rId12" w:history="1">
+        <w:r>
+          <w:rPr>
+            <w:rStyle w:val="Hipervnculo"/>
+          </w:rPr>
+          <w:t>https://github.com/guajardo/Comandos-git</w:t>
+        </w:r>
+      </w:hyperlink>
+    </w:p>
+    <w:p/>
+    <w:p>
+      <w:pPr>
+        <w:pStyle w:val="Ttulo1"/>
+        <w:pBdr>
+          <w:bottom w:val="single" w:sz="6" w:space="11" w:color="E9E9E9"/>
+        </w:pBdr>
+        <w:spacing w:before="0" w:beforeAutospacing="0" w:after="225" w:afterAutospacing="0"/>
+        <w:rPr>
+          <w:rFonts w:ascii="cooper_hewittmedium" w:hAnsi="cooper_hewittmedium"/>
+          <w:color w:val="000000"/>
+          <w:spacing w:val="-2"/>
+          <w:sz w:val="36"/>
+          <w:szCs w:val="36"/>
+        </w:rPr>
+      </w:pPr>
+      <w:r>
+        <w:rPr>
+          <w:rFonts w:ascii="cooper_hewittmedium" w:hAnsi="cooper_hewittmedium"/>
+          <w:color w:val="000000"/>
+          <w:spacing w:val="-2"/>
+          <w:sz w:val="36"/>
+          <w:szCs w:val="36"/>
+        </w:rPr>
+        <w:t>Configurar múltiples colaboradores en un repositorio de GitHub</w:t>
+      </w:r>
+    </w:p>
+    <w:p>
+      <w:pPr>
+        <w:pStyle w:val="NormalWeb"/>
+        <w:spacing w:before="113" w:beforeAutospacing="0" w:after="113" w:afterAutospacing="0"/>
+        <w:rPr>
+          <w:rFonts w:ascii="Lato" w:hAnsi="Lato"/>
+          <w:color w:val="273B47"/>
+        </w:rPr>
+      </w:pPr>
+      <w:r>
+        <w:rPr>
+          <w:rFonts w:ascii="Lato" w:hAnsi="Lato"/>
+          <w:color w:val="273B47"/>
+        </w:rPr>
+        <w:t xml:space="preserve">Por defecto, cualquier persona puede clonar o descargar tu proyecto desde GitHub, pero no pueden crear </w:t>
+      </w:r>
+      <w:proofErr w:type="spellStart"/>
+      <w:r>
+        <w:rPr>
+          <w:rFonts w:ascii="Lato" w:hAnsi="Lato"/>
+          <w:color w:val="273B47"/>
+        </w:rPr>
+        <w:t>commits</w:t>
+      </w:r>
+      <w:proofErr w:type="spellEnd"/>
+      <w:r>
+        <w:rPr>
+          <w:rFonts w:ascii="Lato" w:hAnsi="Lato"/>
+          <w:color w:val="273B47"/>
+        </w:rPr>
+        <w:t>, ni ramas, ni nada.</w:t>
+      </w:r>
+    </w:p>
+    <w:p>
+      <w:pPr>
+        <w:pStyle w:val="NormalWeb"/>
+        <w:spacing w:before="113" w:beforeAutospacing="0" w:after="113" w:afterAutospacing="0"/>
+        <w:rPr>
+          <w:rFonts w:ascii="Lato" w:hAnsi="Lato"/>
+          <w:color w:val="273B47"/>
+        </w:rPr>
+      </w:pPr>
+      <w:r>
+        <w:rPr>
+          <w:rFonts w:ascii="Lato" w:hAnsi="Lato"/>
+          <w:color w:val="273B47"/>
+        </w:rPr>
+        <w:t>Existen varias formas de solucionar esto para poder aceptar contribuciones. Una de ellas es añadir a cada persona de nuestro equipo como colaborador de nuestro repositorio.</w:t>
+      </w:r>
+    </w:p>
+    <w:p>
+      <w:pPr>
+        <w:pStyle w:val="NormalWeb"/>
+        <w:spacing w:before="0" w:beforeAutospacing="0" w:after="0" w:afterAutospacing="0"/>
+        <w:rPr>
+          <w:rFonts w:ascii="Lato" w:hAnsi="Lato"/>
+          <w:color w:val="273B47"/>
+        </w:rPr>
+      </w:pPr>
+      <w:r>
+        <w:rPr>
+          <w:rFonts w:ascii="Lato" w:hAnsi="Lato"/>
+          <w:color w:val="273B47"/>
+        </w:rPr>
+        <w:t>Solo debemos entrar a la configuración de colaboradores de nuestro proyecto (</w:t>
+      </w:r>
+      <w:r>
+        <w:rPr>
+          <w:rStyle w:val="CdigoHTML"/>
+          <w:color w:val="273B47"/>
+        </w:rPr>
+        <w:t xml:space="preserve">Repositorio &gt; </w:t>
+      </w:r>
+      <w:proofErr w:type="spellStart"/>
+      <w:r>
+        <w:rPr>
+          <w:rStyle w:val="CdigoHTML"/>
+          <w:color w:val="273B47"/>
+        </w:rPr>
+        <w:t>Settings</w:t>
+      </w:r>
+      <w:proofErr w:type="spellEnd"/>
+      <w:r>
+        <w:rPr>
+          <w:rStyle w:val="CdigoHTML"/>
+          <w:color w:val="273B47"/>
+        </w:rPr>
+        <w:t xml:space="preserve"> &gt; </w:t>
+      </w:r>
+      <w:proofErr w:type="spellStart"/>
+      <w:r>
+        <w:rPr>
+          <w:rStyle w:val="CdigoHTML"/>
+          <w:color w:val="273B47"/>
+        </w:rPr>
+        <w:t>Collaborators</w:t>
+      </w:r>
+      <w:proofErr w:type="spellEnd"/>
+      <w:r>
+        <w:rPr>
+          <w:rFonts w:ascii="Lato" w:hAnsi="Lato"/>
+          <w:color w:val="273B47"/>
+        </w:rPr>
+        <w:t xml:space="preserve">) y añadir el email o </w:t>
+      </w:r>
+      <w:proofErr w:type="spellStart"/>
+      <w:r>
+        <w:rPr>
+          <w:rFonts w:ascii="Lato" w:hAnsi="Lato"/>
+          <w:color w:val="273B47"/>
+        </w:rPr>
+        <w:t>username</w:t>
+      </w:r>
+      <w:proofErr w:type="spellEnd"/>
+      <w:r>
+        <w:rPr>
+          <w:rFonts w:ascii="Lato" w:hAnsi="Lato"/>
+          <w:color w:val="273B47"/>
+        </w:rPr>
+        <w:t xml:space="preserve"> de los nuevos colaboradores.</w:t>
+      </w:r>
+    </w:p>
+    <w:p>
       <w:bookmarkStart w:id="0" w:name="_GoBack"/>
       <w:bookmarkEnd w:id="0"/>
     </w:p>
@@ -17592,9 +18201,9 @@
     </w:lvl>
   </w:abstractNum>
   <w:abstractNum w:abstractNumId="2" w15:restartNumberingAfterBreak="0">
-    <w:nsid w:val="508B3260"/>
+    <w:nsid w:val="2EB04172"/>
     <w:multiLevelType w:val="multilevel"/>
-    <w:tmpl w:val="AAFE74A8"/>
+    <w:tmpl w:val="DD3283D0"/>
     <w:lvl w:ilvl="0">
       <w:start w:val="1"/>
       <w:numFmt w:val="bullet"/>
@@ -17741,9 +18350,9 @@
     </w:lvl>
   </w:abstractNum>
   <w:abstractNum w:abstractNumId="3" w15:restartNumberingAfterBreak="0">
-    <w:nsid w:val="5C2C47A5"/>
+    <w:nsid w:val="508B3260"/>
     <w:multiLevelType w:val="multilevel"/>
-    <w:tmpl w:val="933031CA"/>
+    <w:tmpl w:val="AAFE74A8"/>
     <w:lvl w:ilvl="0">
       <w:start w:val="1"/>
       <w:numFmt w:val="bullet"/>
@@ -17890,9 +18499,9 @@
     </w:lvl>
   </w:abstractNum>
   <w:abstractNum w:abstractNumId="4" w15:restartNumberingAfterBreak="0">
-    <w:nsid w:val="63CF4219"/>
+    <w:nsid w:val="5C2C47A5"/>
     <w:multiLevelType w:val="multilevel"/>
-    <w:tmpl w:val="03ECB324"/>
+    <w:tmpl w:val="933031CA"/>
     <w:lvl w:ilvl="0">
       <w:start w:val="1"/>
       <w:numFmt w:val="bullet"/>
@@ -18038,20 +18647,172 @@
       </w:rPr>
     </w:lvl>
   </w:abstractNum>
+  <w:abstractNum w:abstractNumId="5" w15:restartNumberingAfterBreak="0">
+    <w:nsid w:val="63CF4219"/>
+    <w:multiLevelType w:val="multilevel"/>
+    <w:tmpl w:val="03ECB324"/>
+    <w:lvl w:ilvl="0">
+      <w:start w:val="1"/>
+      <w:numFmt w:val="bullet"/>
+      <w:lvlText w:val=""/>
+      <w:lvlJc w:val="left"/>
+      <w:pPr>
+        <w:tabs>
+          <w:tab w:val="num" w:pos="720"/>
+        </w:tabs>
+        <w:ind w:left="720" w:hanging="360"/>
+      </w:pPr>
+      <w:rPr>
+        <w:rFonts w:ascii="Symbol" w:hAnsi="Symbol" w:hint="default"/>
+        <w:sz w:val="20"/>
+      </w:rPr>
+    </w:lvl>
+    <w:lvl w:ilvl="1" w:tentative="1">
+      <w:start w:val="1"/>
+      <w:numFmt w:val="bullet"/>
+      <w:lvlText w:val="o"/>
+      <w:lvlJc w:val="left"/>
+      <w:pPr>
+        <w:tabs>
+          <w:tab w:val="num" w:pos="1440"/>
+        </w:tabs>
+        <w:ind w:left="1440" w:hanging="360"/>
+      </w:pPr>
+      <w:rPr>
+        <w:rFonts w:ascii="Courier New" w:hAnsi="Courier New" w:hint="default"/>
+        <w:sz w:val="20"/>
+      </w:rPr>
+    </w:lvl>
+    <w:lvl w:ilvl="2" w:tentative="1">
+      <w:start w:val="1"/>
+      <w:numFmt w:val="bullet"/>
+      <w:lvlText w:val=""/>
+      <w:lvlJc w:val="left"/>
+      <w:pPr>
+        <w:tabs>
+          <w:tab w:val="num" w:pos="2160"/>
+        </w:tabs>
+        <w:ind w:left="2160" w:hanging="360"/>
+      </w:pPr>
+      <w:rPr>
+        <w:rFonts w:ascii="Wingdings" w:hAnsi="Wingdings" w:hint="default"/>
+        <w:sz w:val="20"/>
+      </w:rPr>
+    </w:lvl>
+    <w:lvl w:ilvl="3" w:tentative="1">
+      <w:start w:val="1"/>
+      <w:numFmt w:val="bullet"/>
+      <w:lvlText w:val=""/>
+      <w:lvlJc w:val="left"/>
+      <w:pPr>
+        <w:tabs>
+          <w:tab w:val="num" w:pos="2880"/>
+        </w:tabs>
+        <w:ind w:left="2880" w:hanging="360"/>
+      </w:pPr>
+      <w:rPr>
+        <w:rFonts w:ascii="Wingdings" w:hAnsi="Wingdings" w:hint="default"/>
+        <w:sz w:val="20"/>
+      </w:rPr>
+    </w:lvl>
+    <w:lvl w:ilvl="4" w:tentative="1">
+      <w:start w:val="1"/>
+      <w:numFmt w:val="bullet"/>
+      <w:lvlText w:val=""/>
+      <w:lvlJc w:val="left"/>
+      <w:pPr>
+        <w:tabs>
+          <w:tab w:val="num" w:pos="3600"/>
+        </w:tabs>
+        <w:ind w:left="3600" w:hanging="360"/>
+      </w:pPr>
+      <w:rPr>
+        <w:rFonts w:ascii="Wingdings" w:hAnsi="Wingdings" w:hint="default"/>
+        <w:sz w:val="20"/>
+      </w:rPr>
+    </w:lvl>
+    <w:lvl w:ilvl="5" w:tentative="1">
+      <w:start w:val="1"/>
+      <w:numFmt w:val="bullet"/>
+      <w:lvlText w:val=""/>
+      <w:lvlJc w:val="left"/>
+      <w:pPr>
+        <w:tabs>
+          <w:tab w:val="num" w:pos="4320"/>
+        </w:tabs>
+        <w:ind w:left="4320" w:hanging="360"/>
+      </w:pPr>
+      <w:rPr>
+        <w:rFonts w:ascii="Wingdings" w:hAnsi="Wingdings" w:hint="default"/>
+        <w:sz w:val="20"/>
+      </w:rPr>
+    </w:lvl>
+    <w:lvl w:ilvl="6" w:tentative="1">
+      <w:start w:val="1"/>
+      <w:numFmt w:val="bullet"/>
+      <w:lvlText w:val=""/>
+      <w:lvlJc w:val="left"/>
+      <w:pPr>
+        <w:tabs>
+          <w:tab w:val="num" w:pos="5040"/>
+        </w:tabs>
+        <w:ind w:left="5040" w:hanging="360"/>
+      </w:pPr>
+      <w:rPr>
+        <w:rFonts w:ascii="Wingdings" w:hAnsi="Wingdings" w:hint="default"/>
+        <w:sz w:val="20"/>
+      </w:rPr>
+    </w:lvl>
+    <w:lvl w:ilvl="7" w:tentative="1">
+      <w:start w:val="1"/>
+      <w:numFmt w:val="bullet"/>
+      <w:lvlText w:val=""/>
+      <w:lvlJc w:val="left"/>
+      <w:pPr>
+        <w:tabs>
+          <w:tab w:val="num" w:pos="5760"/>
+        </w:tabs>
+        <w:ind w:left="5760" w:hanging="360"/>
+      </w:pPr>
+      <w:rPr>
+        <w:rFonts w:ascii="Wingdings" w:hAnsi="Wingdings" w:hint="default"/>
+        <w:sz w:val="20"/>
+      </w:rPr>
+    </w:lvl>
+    <w:lvl w:ilvl="8" w:tentative="1">
+      <w:start w:val="1"/>
+      <w:numFmt w:val="bullet"/>
+      <w:lvlText w:val=""/>
+      <w:lvlJc w:val="left"/>
+      <w:pPr>
+        <w:tabs>
+          <w:tab w:val="num" w:pos="6480"/>
+        </w:tabs>
+        <w:ind w:left="6480" w:hanging="360"/>
+      </w:pPr>
+      <w:rPr>
+        <w:rFonts w:ascii="Wingdings" w:hAnsi="Wingdings" w:hint="default"/>
+        <w:sz w:val="20"/>
+      </w:rPr>
+    </w:lvl>
+  </w:abstractNum>
   <w:num w:numId="1">
     <w:abstractNumId w:val="0"/>
   </w:num>
   <w:num w:numId="2">
+    <w:abstractNumId w:val="4"/>
+  </w:num>
+  <w:num w:numId="3">
     <w:abstractNumId w:val="3"/>
   </w:num>
-  <w:num w:numId="3">
-    <w:abstractNumId w:val="2"/>
-  </w:num>
   <w:num w:numId="4">
-    <w:abstractNumId w:val="4"/>
+    <w:abstractNumId w:val="5"/>
   </w:num>
   <w:num w:numId="5">
     <w:abstractNumId w:val="1"/>
+  </w:num>
+  <w:num w:numId="6">
+    <w:abstractNumId w:val="2"/>
   </w:num>
 </w:numbering>
 </file>
@@ -18179,6 +18940,7 @@
     <w:lsdException w:name="HTML Sample" w:semiHidden="1" w:unhideWhenUsed="1"/>
     <w:lsdException w:name="HTML Typewriter" w:semiHidden="1" w:unhideWhenUsed="1"/>
     <w:lsdException w:name="HTML Variable" w:semiHidden="1" w:unhideWhenUsed="1"/>
+    <w:lsdException w:name="Normal Table" w:semiHidden="1" w:unhideWhenUsed="1"/>
     <w:lsdException w:name="annotation subject" w:semiHidden="1" w:unhideWhenUsed="1"/>
     <w:lsdException w:name="No List" w:semiHidden="1" w:unhideWhenUsed="1"/>
     <w:lsdException w:name="Outline List 1" w:semiHidden="1" w:unhideWhenUsed="1"/>
@@ -18221,8 +18983,11 @@
     <w:lsdException w:name="Table Contemporary" w:semiHidden="1" w:unhideWhenUsed="1"/>
     <w:lsdException w:name="Table Elegant" w:semiHidden="1" w:unhideWhenUsed="1"/>
     <w:lsdException w:name="Table Professional" w:semiHidden="1" w:unhideWhenUsed="1"/>
+    <w:lsdException w:name="Table Subtle 1" w:semiHidden="1" w:unhideWhenUsed="1"/>
     <w:lsdException w:name="Table Subtle 2" w:semiHidden="1" w:unhideWhenUsed="1"/>
     <w:lsdException w:name="Table Web 1" w:semiHidden="1" w:unhideWhenUsed="1"/>
+    <w:lsdException w:name="Table Web 2" w:semiHidden="1" w:unhideWhenUsed="1"/>
+    <w:lsdException w:name="Table Web 3" w:semiHidden="1" w:unhideWhenUsed="1"/>
     <w:lsdException w:name="Balloon Text" w:semiHidden="1" w:unhideWhenUsed="1"/>
     <w:lsdException w:name="Table Grid" w:uiPriority="39"/>
     <w:lsdException w:name="Table Theme" w:semiHidden="1" w:unhideWhenUsed="1"/>

</xml_diff>